<commit_message>
Add 5 extra insights to SOA portal document
Co-Authored-By: Claude Opus 5.5 <noreply@anthropic.com>
Claude-Session: https://claude.ai/code/session_01KJbXBnHYhQ5xULZUAvE3YZ
</commit_message>
<xml_diff>
--- a/Insight_SOA_Portal_Mahasiswa.docx
+++ b/Insight_SOA_Portal_Mahasiswa.docx
@@ -465,6 +465,262 @@
       </w:r>
       <w:r>
         <w:t xml:space="preserve">Portal tetap menampilkan KHS tanpa memeriksa status bayar; kalau aturan kampus mewajibkan UKT lunas, perlu ditambah validasi. Angka 3.77 sebenarnya IP semester 1, bukan IPK. Tabel bobot_nilai juga belum punya nilai D dan E, sehingga nilai seperti itu otomatis dihitung 0.</w:t>
+      </w:r>
+    </w:p>
+    <w:p>
+      <w:pPr>
+        <w:pStyle w:val="Heading1"/>
+      </w:pPr>
+      <w:r>
+        <w:t xml:space="preserve">Insight Tambahan</w:t>
+      </w:r>
+    </w:p>
+    <w:p>
+      <w:pPr>
+        <w:spacing w:after="120"/>
+      </w:pPr>
+      <w:r>
+        <w:t xml:space="preserve">Insight berikut bisa dipakai sebagai bahan tambahan, pendalaman, atau jawaban saat sesi tanya jawab.</w:t>
+      </w:r>
+    </w:p>
+    <w:p>
+      <w:pPr>
+        <w:pStyle w:val="Heading2"/>
+      </w:pPr>
+      <w:r>
+        <w:t xml:space="preserve">Insight 7 – Client Harus Tahu Kontrak XML dengan Tepat</w:t>
+      </w:r>
+    </w:p>
+    <w:p>
+      <w:pPr>
+        <w:pStyle w:val="ListParagraph"/>
+        <w:numPr>
+          <w:ilvl w:val="0"/>
+          <w:numId w:val="2"/>
+        </w:numPr>
+        <w:spacing w:after="80"/>
+      </w:pPr>
+      <w:r>
+        <w:rPr>
+          <w:b/>
+          <w:bCs/>
+        </w:rPr>
+        <w:t xml:space="preserve">Bukti dari output: </w:t>
+      </w:r>
+      <w:r>
+        <w:t xml:space="preserve">Portal memakai namespace yang sama persis dengan service (mis. http://kampus.ac.id/siakad) dan mengubah teks XML menjadi angka dengan int() untuk Angkatan, SKS, dan Nominal.</w:t>
+      </w:r>
+    </w:p>
+    <w:p>
+      <w:pPr>
+        <w:pStyle w:val="ListParagraph"/>
+        <w:numPr>
+          <w:ilvl w:val="0"/>
+          <w:numId w:val="2"/>
+        </w:numPr>
+        <w:spacing w:after="80"/>
+      </w:pPr>
+      <w:r>
+        <w:rPr>
+          <w:b/>
+          <w:bCs/>
+        </w:rPr>
+        <w:t xml:space="preserve">Insight: </w:t>
+      </w:r>
+      <w:r>
+        <w:t xml:space="preserve">Di SOAP, semua data dikirim sebagai teks, sehingga client harus tahu struktur dan tipe datanya (biasanya diatur lewat WSDL/XSD). Kalau service mengganti namespace atau nama tag, parsing akan gagal dan portal mengira datanya tidak ada.</w:t>
+      </w:r>
+    </w:p>
+    <w:p>
+      <w:pPr>
+        <w:pStyle w:val="Heading2"/>
+      </w:pPr>
+      <w:r>
+        <w:t xml:space="preserve">Insight 8 – Format XML Lebih Boros Dibanding JSON</w:t>
+      </w:r>
+    </w:p>
+    <w:p>
+      <w:pPr>
+        <w:pStyle w:val="ListParagraph"/>
+        <w:numPr>
+          <w:ilvl w:val="0"/>
+          <w:numId w:val="2"/>
+        </w:numPr>
+        <w:spacing w:after="80"/>
+      </w:pPr>
+      <w:r>
+        <w:rPr>
+          <w:b/>
+          <w:bCs/>
+        </w:rPr>
+        <w:t xml:space="preserve">Bukti dari output: </w:t>
+      </w:r>
+      <w:r>
+        <w:t xml:space="preserve">Response SIKEU untuk NIM 2022001 hanya membawa 4 data (NIM, Status, Nominal, TglBayar), tapi XML-nya sekitar 12 baris karena ada Envelope, Body, namespace, dan tag pembuka/penutup.</w:t>
+      </w:r>
+    </w:p>
+    <w:p>
+      <w:pPr>
+        <w:pStyle w:val="ListParagraph"/>
+        <w:numPr>
+          <w:ilvl w:val="0"/>
+          <w:numId w:val="2"/>
+        </w:numPr>
+        <w:spacing w:after="80"/>
+      </w:pPr>
+      <w:r>
+        <w:rPr>
+          <w:b/>
+          <w:bCs/>
+        </w:rPr>
+        <w:t xml:space="preserve">Insight: </w:t>
+      </w:r>
+      <w:r>
+        <w:t xml:space="preserve">SOAP lebih ketat dan terstandar, tapi ukuran pesannya lebih besar dan lebih lambat diproses. Untuk data sederhana, REST + JSON lebih ringan. Library json sebenarnya sudah di-import di kode, tapi belum dipakai.</w:t>
+      </w:r>
+    </w:p>
+    <w:p>
+      <w:pPr>
+        <w:pStyle w:val="Heading2"/>
+      </w:pPr>
+      <w:r>
+        <w:t xml:space="preserve">Insight 9 – Pemanggilan Service Masih Berurutan</w:t>
+      </w:r>
+    </w:p>
+    <w:p>
+      <w:pPr>
+        <w:pStyle w:val="ListParagraph"/>
+        <w:numPr>
+          <w:ilvl w:val="0"/>
+          <w:numId w:val="2"/>
+        </w:numPr>
+        <w:spacing w:after="80"/>
+      </w:pPr>
+      <w:r>
+        <w:rPr>
+          <w:b/>
+          <w:bCs/>
+        </w:rPr>
+        <w:t xml:space="preserve">Bukti dari output: </w:t>
+      </w:r>
+      <w:r>
+        <w:t xml:space="preserve">Langkah [1/3], [2/3], [3/3] dijalankan satu per satu, dan semua timestamp di audit trail sama (detik yang sama) karena service masih disimulasikan di satu program.</w:t>
+      </w:r>
+    </w:p>
+    <w:p>
+      <w:pPr>
+        <w:pStyle w:val="ListParagraph"/>
+        <w:numPr>
+          <w:ilvl w:val="0"/>
+          <w:numId w:val="2"/>
+        </w:numPr>
+        <w:spacing w:after="80"/>
+      </w:pPr>
+      <w:r>
+        <w:rPr>
+          <w:b/>
+          <w:bCs/>
+        </w:rPr>
+        <w:t xml:space="preserve">Insight: </w:t>
+      </w:r>
+      <w:r>
+        <w:t xml:space="preserve">Di sistem nyata, tiap pemanggilan lewat jaringan punya jeda (latency). SINILAI dan SIKEU sebenarnya tidak saling bergantung, jadi bisa dipanggil bersamaan (paralel) setelah SIAKAD berhasil. Perlu juga timeout dan retry kalau service lambat atau mati.</w:t>
+      </w:r>
+    </w:p>
+    <w:p>
+      <w:pPr>
+        <w:pStyle w:val="Heading2"/>
+      </w:pPr>
+      <w:r>
+        <w:t xml:space="preserve">Insight 10 – XML Dibangun dengan f-string Tanpa Escaping</w:t>
+      </w:r>
+    </w:p>
+    <w:p>
+      <w:pPr>
+        <w:pStyle w:val="ListParagraph"/>
+        <w:numPr>
+          <w:ilvl w:val="0"/>
+          <w:numId w:val="2"/>
+        </w:numPr>
+        <w:spacing w:after="80"/>
+      </w:pPr>
+      <w:r>
+        <w:rPr>
+          <w:b/>
+          <w:bCs/>
+        </w:rPr>
+        <w:t xml:space="preserve">Bukti dari output: </w:t>
+      </w:r>
+      <w:r>
+        <w:t xml:space="preserve">Semua response dibuat dengan f-string, misalnya &lt;siakad:Nama&gt;{data["nama"]}&lt;/siakad:Nama&gt;, dan output masih normal karena nama di database tidak mengandung karakter khusus.</w:t>
+      </w:r>
+    </w:p>
+    <w:p>
+      <w:pPr>
+        <w:pStyle w:val="ListParagraph"/>
+        <w:numPr>
+          <w:ilvl w:val="0"/>
+          <w:numId w:val="2"/>
+        </w:numPr>
+        <w:spacing w:after="80"/>
+      </w:pPr>
+      <w:r>
+        <w:rPr>
+          <w:b/>
+          <w:bCs/>
+        </w:rPr>
+        <w:t xml:space="preserve">Insight: </w:t>
+      </w:r>
+      <w:r>
+        <w:t xml:space="preserve">Kalau ada data berisi karakter seperti &amp; atau &lt; (mis. nama jurusan "Bisnis &amp; Manajemen"), XML menjadi tidak valid dan portal akan menampilkan "Parse error". Sebaiknya XML dibangun dengan ElementTree atau di-escape dulu.</w:t>
+      </w:r>
+    </w:p>
+    <w:p>
+      <w:pPr>
+        <w:pStyle w:val="Heading2"/>
+      </w:pPr>
+      <w:r>
+        <w:t xml:space="preserve">Insight 11 – Belum Ada Autentikasi</w:t>
+      </w:r>
+    </w:p>
+    <w:p>
+      <w:pPr>
+        <w:pStyle w:val="ListParagraph"/>
+        <w:numPr>
+          <w:ilvl w:val="0"/>
+          <w:numId w:val="2"/>
+        </w:numPr>
+        <w:spacing w:after="80"/>
+      </w:pPr>
+      <w:r>
+        <w:rPr>
+          <w:b/>
+          <w:bCs/>
+        </w:rPr>
+        <w:t xml:space="preserve">Bukti dari output: </w:t>
+      </w:r>
+      <w:r>
+        <w:t xml:space="preserve">Cukup dengan memasukkan NIM, portal bisa mendapat nama, nilai, dan status pembayaran (termasuk nominal UKT) tanpa login atau token.</w:t>
+      </w:r>
+    </w:p>
+    <w:p>
+      <w:pPr>
+        <w:pStyle w:val="ListParagraph"/>
+        <w:numPr>
+          <w:ilvl w:val="0"/>
+          <w:numId w:val="2"/>
+        </w:numPr>
+        <w:spacing w:after="80"/>
+      </w:pPr>
+      <w:r>
+        <w:rPr>
+          <w:b/>
+          <w:bCs/>
+        </w:rPr>
+        <w:t xml:space="preserve">Insight: </w:t>
+      </w:r>
+      <w:r>
+        <w:t xml:space="preserve">Data nilai dan keuangan termasuk data pribadi. Di sistem nyata, service perlu autentikasi dan otorisasi (mis. WS-Security pada SOAP) agar hanya mahasiswa yang bersangkutan atau pihak berwenang yang bisa mengakses.</w:t>
       </w:r>
     </w:p>
     <w:sectPr>

</xml_diff>